<commit_message>
docs & diagrams: depuracion exhaustiva de diagramas, sincronizacion de modelos logico y fisico BD CAD B&W y regeneracion documental APF2
</commit_message>
<xml_diff>
--- a/docs/08_Normalizacion_Base_Datos.docx
+++ b/docs/08_Normalizacion_Base_Datos.docx
@@ -865,7 +865,163 @@
           <w:color w:val="F97316"/>
           <w:sz w:val="28"/>
         </w:rPr>
-        <w:t>3. CONCLUSIÓN TÉCNICA</w:t>
+        <w:t>3. DIAGRAMAS ARQUITECTURALES DE BASE DE DATOS</w:t>
+      </w:r>
+    </w:p>
+    <w:p>
+      <w:pPr>
+        <w:pStyle w:val="ListBullet"/>
+        <w:spacing w:before="20" w:after="40" w:line="276" w:lineRule="auto"/>
+      </w:pPr>
+      <w:r>
+        <w:rPr>
+          <w:rFonts w:ascii="Calibri" w:hAnsi="Calibri"/>
+          <w:color w:val="1E293B"/>
+          <w:sz w:val="21"/>
+        </w:rPr>
+        <w:t xml:space="preserve">📐 </w:t>
+      </w:r>
+      <w:r>
+        <w:rPr>
+          <w:rFonts w:ascii="Calibri" w:hAnsi="Calibri"/>
+          <w:b/>
+          <w:color w:val="1E293B"/>
+          <w:sz w:val="21"/>
+        </w:rPr>
+        <w:t>Diagrama de Modelo Lógico (DER Conceptual):</w:t>
+      </w:r>
+      <w:r>
+        <w:rPr>
+          <w:rFonts w:ascii="Calibri" w:hAnsi="Calibri"/>
+          <w:color w:val="1E293B"/>
+          <w:sz w:val="21"/>
+        </w:rPr>
+        <w:t xml:space="preserve"> [</w:t>
+      </w:r>
+      <w:r>
+        <w:rPr>
+          <w:rFonts w:ascii="Consolas" w:hAnsi="Consolas"/>
+          <w:color w:val="C2410C"/>
+          <w:sz w:val="19"/>
+        </w:rPr>
+        <w:t>diagrams/12_Modelo_Logico_BD.png</w:t>
+      </w:r>
+      <w:r>
+        <w:rPr>
+          <w:rFonts w:ascii="Calibri" w:hAnsi="Calibri"/>
+          <w:color w:val="1E293B"/>
+          <w:sz w:val="21"/>
+        </w:rPr>
+        <w:t>](../diagrams/12_Modelo_Logico_BD.png)</w:t>
+      </w:r>
+    </w:p>
+    <w:p>
+      <w:pPr>
+        <w:pStyle w:val="ListBullet"/>
+        <w:spacing w:before="20" w:after="40" w:line="276" w:lineRule="auto"/>
+      </w:pPr>
+      <w:r>
+        <w:rPr>
+          <w:rFonts w:ascii="Calibri" w:hAnsi="Calibri"/>
+          <w:color w:val="1E293B"/>
+          <w:sz w:val="21"/>
+        </w:rPr>
+        <w:t xml:space="preserve">🗄️ </w:t>
+      </w:r>
+      <w:r>
+        <w:rPr>
+          <w:rFonts w:ascii="Calibri" w:hAnsi="Calibri"/>
+          <w:b/>
+          <w:color w:val="1E293B"/>
+          <w:sz w:val="21"/>
+        </w:rPr>
+        <w:t>Diagrama de Modelo Físico (DDL Relacional 3FN/BCNF):</w:t>
+      </w:r>
+      <w:r>
+        <w:rPr>
+          <w:rFonts w:ascii="Calibri" w:hAnsi="Calibri"/>
+          <w:color w:val="1E293B"/>
+          <w:sz w:val="21"/>
+        </w:rPr>
+        <w:t xml:space="preserve"> [</w:t>
+      </w:r>
+      <w:r>
+        <w:rPr>
+          <w:rFonts w:ascii="Consolas" w:hAnsi="Consolas"/>
+          <w:color w:val="C2410C"/>
+          <w:sz w:val="19"/>
+        </w:rPr>
+        <w:t>diagrams/13_Modelo_Fisico_BD.png</w:t>
+      </w:r>
+      <w:r>
+        <w:rPr>
+          <w:rFonts w:ascii="Calibri" w:hAnsi="Calibri"/>
+          <w:color w:val="1E293B"/>
+          <w:sz w:val="21"/>
+        </w:rPr>
+        <w:t>](../diagrams/13_Modelo_Fisico_BD.png)</w:t>
+      </w:r>
+    </w:p>
+    <w:p>
+      <w:pPr>
+        <w:pStyle w:val="ListBullet"/>
+        <w:spacing w:before="20" w:after="40" w:line="276" w:lineRule="auto"/>
+      </w:pPr>
+      <w:r>
+        <w:rPr>
+          <w:rFonts w:ascii="Calibri" w:hAnsi="Calibri"/>
+          <w:color w:val="1E293B"/>
+          <w:sz w:val="21"/>
+        </w:rPr>
+        <w:t xml:space="preserve">📊 </w:t>
+      </w:r>
+      <w:r>
+        <w:rPr>
+          <w:rFonts w:ascii="Calibri" w:hAnsi="Calibri"/>
+          <w:b/>
+          <w:color w:val="1E293B"/>
+          <w:sz w:val="21"/>
+        </w:rPr>
+        <w:t>Diagrama de Entidades Complementario:</w:t>
+      </w:r>
+      <w:r>
+        <w:rPr>
+          <w:rFonts w:ascii="Calibri" w:hAnsi="Calibri"/>
+          <w:color w:val="1E293B"/>
+          <w:sz w:val="21"/>
+        </w:rPr>
+        <w:t xml:space="preserve"> [</w:t>
+      </w:r>
+      <w:r>
+        <w:rPr>
+          <w:rFonts w:ascii="Consolas" w:hAnsi="Consolas"/>
+          <w:color w:val="C2410C"/>
+          <w:sz w:val="19"/>
+        </w:rPr>
+        <w:t>diagrams/14_Diagrama_DB.png</w:t>
+      </w:r>
+      <w:r>
+        <w:rPr>
+          <w:rFonts w:ascii="Calibri" w:hAnsi="Calibri"/>
+          <w:color w:val="1E293B"/>
+          <w:sz w:val="21"/>
+        </w:rPr>
+        <w:t>](../diagrams/14_Diagrama_DB.png)</w:t>
+      </w:r>
+    </w:p>
+    <w:p>
+      <w:pPr>
+        <w:keepNext/>
+        <w:spacing w:before="280" w:after="80"/>
+      </w:pPr>
+      <w:r>
+        <w:rPr>
+          <w:rFonts w:ascii="Calibri" w:hAnsi="Calibri"/>
+          <w:b/>
+          <w:color w:val="F97316"/>
+          <w:sz w:val="28"/>
+        </w:rPr>
+        <w:t>4. CONCLUSIÓN TÉCNICA</w:t>
       </w:r>
     </w:p>
     <w:p>

</xml_diff>